<commit_message>
fix(cover-letter): move Multi AI paragraph before requirements table
</commit_message>
<xml_diff>
--- a/cover_letter_1X_VLA.docx
+++ b/cover_letter_1X_VLA.docx
@@ -141,6 +141,19 @@
         <w:rPr>
           <w:sz w:val="22"/>
         </w:rPr>
+      </w:r>
+    </w:p>
+    <w:p>
+      <w:pPr>
+        <w:pStyle w:val="normal1"/>
+        <w:spacing w:lineRule="auto" w:line="240" w:before="0" w:after="160"/>
+        <w:rPr>
+          <w:rFonts w:ascii="Arial" w:hAnsi="Arial" w:eastAsia="Arial" w:cs="Arial"/>
+        </w:rPr>
+      </w:pPr>
+      <w:r>
+        <w:rPr/>
+        <w:t>Before my postdoc, I co-founded Multi AI and built a multi-agent RL platform that coordinated 100+ vehicles in contested logistics, scaling from a PhD prototype to seven figures in Air Force SBIR contracts and deploying learned policies into production fleets. My qualifications match your requirements directly:</w:t>
       </w:r>
     </w:p>
     <w:tbl>
@@ -747,19 +760,6 @@
         </w:tc>
       </w:tr>
     </w:tbl>
-    <w:p>
-      <w:pPr>
-        <w:pStyle w:val="normal1"/>
-        <w:spacing w:lineRule="auto" w:line="240" w:before="0" w:after="160"/>
-        <w:rPr>
-          <w:rFonts w:ascii="Arial" w:hAnsi="Arial" w:eastAsia="Arial" w:cs="Arial"/>
-        </w:rPr>
-      </w:pPr>
-      <w:r>
-        <w:rPr/>
-        <w:t>Before my postdoc, I co-founded Multi AI and built a multi-agent RL platform that coordinated 100+ vehicles in contested logistics, scaling from a PhD prototype to seven figures in Air Force SBIR contracts and deploying learned policies into production fleets. My qualifications match your requirements directly:</w:t>
-      </w:r>
-    </w:p>
     <w:p>
       <w:pPr>
         <w:pStyle w:val="normal1"/>

</xml_diff>

<commit_message>
fix(cover-letter): condense tool/sim rows and strengthen closing
</commit_message>
<xml_diff>
--- a/cover_letter_1X_VLA.docx
+++ b/cover_letter_1X_VLA.docx
@@ -556,7 +556,7 @@
               <w:rPr>
                 <w:sz w:val="17"/>
               </w:rPr>
-              <w:t>Python + Bazel</w:t>
+              <w:t>Python, PyTorch, and simulation environments (Isaac Sim / MuJoCo)</w:t>
             </w:r>
           </w:p>
         </w:tc>
@@ -583,178 +583,7 @@
               <w:rPr>
                 <w:sz w:val="17"/>
               </w:rPr>
-              <w:t>Python is my primary language across all research and production work; I have cursory Bazel experience, with most build system work in CMake.</w:t>
-            </w:r>
-          </w:p>
-        </w:tc>
-      </w:tr>
-      <w:tr>
-        <w:trPr/>
-        <w:tc>
-          <w:tcPr>
-            <w:tcW w:w="3255" w:type="dxa"/>
-            <w:tcBorders>
-              <w:top w:val="single" w:sz="4" w:space="0" w:color="CCCCCC"/>
-              <w:left w:val="single" w:sz="4" w:space="0" w:color="CCCCCC"/>
-              <w:bottom w:val="single" w:sz="4" w:space="0" w:color="CCCCCC"/>
-              <w:right w:val="single" w:sz="4" w:space="0" w:color="CCCCCC"/>
-            </w:tcBorders>
-          </w:tcPr>
-          <w:p>
-            <w:pPr>
-              <w:pStyle w:val="normal1"/>
-              <w:spacing w:lineRule="auto" w:line="240" w:before="0" w:after="60"/>
-              <w:rPr>
-                <w:highlight w:val="none"/>
-                <w:shd w:fill="FFFF00" w:val="clear"/>
-              </w:rPr>
-            </w:pPr>
-            <w:r>
-              <w:rPr>
-                <w:sz w:val="17"/>
-              </w:rPr>
-              <w:t>PyTorch</w:t>
-            </w:r>
-          </w:p>
-        </w:tc>
-        <w:tc>
-          <w:tcPr>
-            <w:tcW w:w="6104" w:type="dxa"/>
-            <w:tcBorders>
-              <w:top w:val="single" w:sz="4" w:space="0" w:color="CCCCCC"/>
-              <w:left w:val="single" w:sz="4" w:space="0" w:color="CCCCCC"/>
-              <w:bottom w:val="single" w:sz="4" w:space="0" w:color="CCCCCC"/>
-              <w:right w:val="single" w:sz="4" w:space="0" w:color="CCCCCC"/>
-            </w:tcBorders>
-          </w:tcPr>
-          <w:p>
-            <w:pPr>
-              <w:pStyle w:val="normal1"/>
-              <w:spacing w:lineRule="auto" w:line="240" w:before="0" w:after="60"/>
-              <w:rPr>
-                <w:highlight w:val="none"/>
-                <w:shd w:fill="FFFF00" w:val="clear"/>
-              </w:rPr>
-            </w:pPr>
-            <w:r>
-              <w:rPr>
-                <w:sz w:val="17"/>
-              </w:rPr>
-              <w:t>PyTorch is my primary deep learning framework, used throughout my postdoc VLA work, the Multi AI MARL platform, and PhD research.</w:t>
-            </w:r>
-          </w:p>
-        </w:tc>
-      </w:tr>
-      <w:tr>
-        <w:trPr/>
-        <w:tc>
-          <w:tcPr>
-            <w:tcW w:w="3255" w:type="dxa"/>
-            <w:tcBorders>
-              <w:top w:val="single" w:sz="4" w:space="0" w:color="CCCCCC"/>
-              <w:left w:val="single" w:sz="4" w:space="0" w:color="CCCCCC"/>
-              <w:bottom w:val="single" w:sz="4" w:space="0" w:color="CCCCCC"/>
-              <w:right w:val="single" w:sz="4" w:space="0" w:color="CCCCCC"/>
-            </w:tcBorders>
-          </w:tcPr>
-          <w:p>
-            <w:pPr>
-              <w:pStyle w:val="normal1"/>
-              <w:spacing w:lineRule="auto" w:line="240" w:before="0" w:after="60"/>
-              <w:rPr>
-                <w:highlight w:val="none"/>
-                <w:shd w:fill="FFFF00" w:val="clear"/>
-              </w:rPr>
-            </w:pPr>
-            <w:r>
-              <w:rPr>
-                <w:sz w:val="17"/>
-              </w:rPr>
-              <w:t>Simulation environments (Isaac Sim / MuJoCo)</w:t>
-            </w:r>
-          </w:p>
-        </w:tc>
-        <w:tc>
-          <w:tcPr>
-            <w:tcW w:w="6104" w:type="dxa"/>
-            <w:tcBorders>
-              <w:top w:val="single" w:sz="4" w:space="0" w:color="CCCCCC"/>
-              <w:left w:val="single" w:sz="4" w:space="0" w:color="CCCCCC"/>
-              <w:bottom w:val="single" w:sz="4" w:space="0" w:color="CCCCCC"/>
-              <w:right w:val="single" w:sz="4" w:space="0" w:color="CCCCCC"/>
-            </w:tcBorders>
-          </w:tcPr>
-          <w:p>
-            <w:pPr>
-              <w:pStyle w:val="normal1"/>
-              <w:spacing w:lineRule="auto" w:line="240" w:before="0" w:after="60"/>
-              <w:rPr>
-                <w:highlight w:val="none"/>
-                <w:shd w:fill="FFFF00" w:val="clear"/>
-              </w:rPr>
-            </w:pPr>
-            <w:r>
-              <w:rPr>
-                <w:sz w:val="17"/>
-              </w:rPr>
-              <w:t>I trained Spot's bipedal locomotion policy in NVIDIA Isaac Lab with successful sim-to-real transfer deployed on hardware, and evaluated VLA models in the DROID simulation environment.</w:t>
-            </w:r>
-          </w:p>
-        </w:tc>
-      </w:tr>
-      <w:tr>
-        <w:trPr/>
-        <w:tc>
-          <w:tcPr>
-            <w:tcW w:w="3255" w:type="dxa"/>
-            <w:tcBorders>
-              <w:top w:val="single" w:sz="4" w:space="0" w:color="CCCCCC"/>
-              <w:left w:val="single" w:sz="4" w:space="0" w:color="CCCCCC"/>
-              <w:bottom w:val="single" w:sz="4" w:space="0" w:color="CCCCCC"/>
-              <w:right w:val="single" w:sz="4" w:space="0" w:color="CCCCCC"/>
-            </w:tcBorders>
-          </w:tcPr>
-          <w:p>
-            <w:pPr>
-              <w:pStyle w:val="normal1"/>
-              <w:spacing w:lineRule="auto" w:line="240" w:before="0" w:after="60"/>
-              <w:rPr>
-                <w:highlight w:val="none"/>
-                <w:shd w:fill="FFFF00" w:val="clear"/>
-              </w:rPr>
-            </w:pPr>
-            <w:r>
-              <w:rPr>
-                <w:sz w:val="17"/>
-              </w:rPr>
-              <w:t>Generalization in autonomous systems</w:t>
-            </w:r>
-          </w:p>
-        </w:tc>
-        <w:tc>
-          <w:tcPr>
-            <w:tcW w:w="6104" w:type="dxa"/>
-            <w:tcBorders>
-              <w:top w:val="single" w:sz="4" w:space="0" w:color="CCCCCC"/>
-              <w:left w:val="single" w:sz="4" w:space="0" w:color="CCCCCC"/>
-              <w:bottom w:val="single" w:sz="4" w:space="0" w:color="CCCCCC"/>
-              <w:right w:val="single" w:sz="4" w:space="0" w:color="CCCCCC"/>
-            </w:tcBorders>
-          </w:tcPr>
-          <w:p>
-            <w:pPr>
-              <w:pStyle w:val="normal1"/>
-              <w:spacing w:lineRule="auto" w:line="240" w:before="0" w:after="60"/>
-              <w:rPr>
-                <w:highlight w:val="none"/>
-                <w:shd w:fill="FFFF00" w:val="clear"/>
-              </w:rPr>
-            </w:pPr>
-            <w:r>
-              <w:rPr>
-                <w:sz w:val="17"/>
-              </w:rPr>
-              <w:t>My postdoc focuses on deploying and evaluating VLA models and World Action Models across simulation and physical hardware for general-purpose manipulation; at Multi AI, I generalized MARL policies to novel contested logistics scenarios, outperforming baselines by 38%.</w:t>
+              <w:t>Python is my primary language and PyTorch my primary framework across all research and production work; I trained and transferred policies in NVIDIA Isaac Lab (Spot bipedal locomotion) and evaluated VLA models in DROID simulation. Build system experience is primarily CMake, with cursory Bazel familiarity.</w:t>
             </w:r>
           </w:p>
         </w:tc>
@@ -791,7 +620,7 @@
         <w:rPr>
           <w:sz w:val="22"/>
         </w:rPr>
-        <w:t>The chance to deploy VLA models on humanoid hardware at 1X’s scale is a direct extension of my current research, and I would welcome a conversation about how I can contribute to NEO’s development. I look forward to hearing from you.</w:t>
+        <w:t>The chance to deploy VLA models on humanoid hardware at 1X’s scale is a direct extension of my current research, and I am eager to discuss how I can contribute to NEO’s development. I look forward to hearing from you.</w:t>
       </w:r>
     </w:p>
     <w:p>

</xml_diff>

<commit_message>
fix(cover-letter): shorten second paragraph and rewrite closing
</commit_message>
<xml_diff>
--- a/cover_letter_1X_VLA.docx
+++ b/cover_letter_1X_VLA.docx
@@ -153,7 +153,7 @@
       </w:pPr>
       <w:r>
         <w:rPr/>
-        <w:t>Before my postdoc, I co-founded Multi AI and built a multi-agent RL platform that coordinated 100+ vehicles in contested logistics, scaling from a PhD prototype to seven figures in Air Force SBIR contracts and deploying learned policies into production fleets. My qualifications match your requirements directly:</w:t>
+        <w:t>Before my postdoc, I deployed learned policies into production fleets at scale as co-founder of Multi AI. My background is a strong fit for this role:</w:t>
       </w:r>
     </w:p>
     <w:tbl>
@@ -620,7 +620,7 @@
         <w:rPr>
           <w:sz w:val="22"/>
         </w:rPr>
-        <w:t>The chance to deploy VLA models on humanoid hardware at 1X’s scale is a direct extension of my current research, and I am eager to discuss how I can contribute to NEO’s development. I look forward to hearing from you.</w:t>
+        <w:t>My current work centers on deploying robot foundation models on physical hardware, and I am confident that experience translates directly to NEO’s development. I look forward to discussing how I can contribute.</w:t>
       </w:r>
     </w:p>
     <w:p>

</xml_diff>

<commit_message>
fix(cover-letter): trim intro paragraph to single transition sentence
</commit_message>
<xml_diff>
--- a/cover_letter_1X_VLA.docx
+++ b/cover_letter_1X_VLA.docx
@@ -51,43 +51,6 @@
       <w:r>
         <w:rPr>
           <w:rFonts w:eastAsia="Arial" w:cs="Arial" w:ascii="Arial" w:hAnsi="Arial"/>
-          <w:sz w:val="22"/>
-          <w:szCs w:val="22"/>
-        </w:rPr>
-        <w:t>Attn: Hiring Manager</w:t>
-      </w:r>
-    </w:p>
-    <w:p>
-      <w:pPr>
-        <w:pStyle w:val="normal1"/>
-        <w:spacing w:lineRule="auto" w:line="240" w:before="0" w:after="40"/>
-        <w:jc w:val="left"/>
-        <w:rPr>
-          <w:highlight w:val="none"/>
-          <w:shd w:fill="FFFF00" w:val="clear"/>
-        </w:rPr>
-      </w:pPr>
-      <w:r>
-        <w:rPr>
-          <w:sz w:val="22"/>
-        </w:rPr>
-        <w:t>1X Technologies | Palo Alto, CA</w:t>
-      </w:r>
-    </w:p>
-    <w:p>
-      <w:pPr>
-        <w:pStyle w:val="normal1"/>
-        <w:spacing w:lineRule="auto" w:line="240" w:before="0" w:after="200"/>
-        <w:jc w:val="left"/>
-        <w:rPr>
-          <w:rFonts w:ascii="Arial" w:hAnsi="Arial" w:eastAsia="Arial" w:cs="Arial"/>
-          <w:sz w:val="8"/>
-          <w:szCs w:val="8"/>
-        </w:rPr>
-      </w:pPr>
-      <w:r>
-        <w:rPr>
-          <w:rFonts w:eastAsia="Arial" w:cs="Arial" w:ascii="Arial" w:hAnsi="Arial"/>
           <w:sz w:val="8"/>
           <w:szCs w:val="8"/>
         </w:rPr>
@@ -123,7 +86,7 @@
         <w:rPr>
           <w:sz w:val="22"/>
         </w:rPr>
-        <w:t>I am a postdoctoral fellow in robotics at the University of Texas at Austin, and I am writing to apply for the AI Research Engineer, Vision-Language Action (VLA) Models position at 1X. 1X is among the few teams deploying humanoid robots in unstructured, real-world environments at production scale, and enabling long-horizon autonomy in those settings is the focus of my research.</w:t>
+        <w:t xml:space="preserve">I am a postdoctoral fellow in robotics at the University of Texas at Austin, and I am writing to apply for the AI Research Engineer, Vision-Language Action (VLA) Models position at 1X. </w:t>
       </w:r>
     </w:p>
     <w:p>
@@ -134,26 +97,13 @@
           <w:rFonts w:ascii="Arial" w:hAnsi="Arial" w:eastAsia="Arial" w:cs="Arial"/>
           <w:sz w:val="22"/>
           <w:szCs w:val="22"/>
-          <w:highlight w:val="yellow"/>
         </w:rPr>
       </w:pPr>
       <w:r>
         <w:rPr>
           <w:sz w:val="22"/>
         </w:rPr>
-      </w:r>
-    </w:p>
-    <w:p>
-      <w:pPr>
-        <w:pStyle w:val="normal1"/>
-        <w:spacing w:lineRule="auto" w:line="240" w:before="0" w:after="160"/>
-        <w:rPr>
-          <w:rFonts w:ascii="Arial" w:hAnsi="Arial" w:eastAsia="Arial" w:cs="Arial"/>
-        </w:rPr>
-      </w:pPr>
-      <w:r>
-        <w:rPr/>
-        <w:t>Before my postdoc, I deployed learned policies into production fleets at scale as co-founder of Multi AI. My background is a strong fit for this role:</w:t>
+        <w:t>Deploying robot foundation models on physical hardware in unstructured environments is the focus of my postdoc, and the table below maps my experience to your requirements directly:</w:t>
       </w:r>
     </w:p>
     <w:tbl>
@@ -355,7 +305,19 @@
               <w:rPr>
                 <w:sz w:val="17"/>
               </w:rPr>
-              <w:t>In my postdoc, I trained SmolVLA on 200+ demonstration episodes for household manipulation tasks on a custom bimanual platform and trained Spot for bipedal locomotion with PPO and domain randomization in NVIDIA Isaac Lab, deploying both on physical hardware.</w:t>
+              <w:t xml:space="preserve">In my postdoc, I trained SmolVLA </w:t>
+            </w:r>
+            <w:r>
+              <w:rPr>
+                <w:sz w:val="17"/>
+              </w:rPr>
+              <w:t>and ACT</w:t>
+            </w:r>
+            <w:r>
+              <w:rPr>
+                <w:sz w:val="17"/>
+              </w:rPr>
+              <w:t xml:space="preserve"> on 200+ demonstration episodes for household manipulation tasks on a custom bimanual platform and trained Spot for bipedal locomotion with PPO and domain randomization in NVIDIA Isaac Lab, deploying both on physical hardware.</w:t>
             </w:r>
           </w:p>
         </w:tc>
@@ -583,7 +545,7 @@
               <w:rPr>
                 <w:sz w:val="17"/>
               </w:rPr>
-              <w:t>Python is my primary language and PyTorch my primary framework across all research and production work; I trained and transferred policies in NVIDIA Isaac Lab (Spot bipedal locomotion) and evaluated VLA models in DROID simulation. Build system experience is primarily CMake, with cursory Bazel familiarity.</w:t>
+              <w:t>Python is my primary language and PyTorch my primary framework across all research and production work; I trained and transferred policies in NVIDIA Isaac Lab (Spot bipedal locomotion) and evaluated VLA models in DROID simulation. Build system experience is primarily CMake, with Bazel familiarity.</w:t>
             </w:r>
           </w:p>
         </w:tc>
@@ -592,18 +554,15 @@
     <w:p>
       <w:pPr>
         <w:pStyle w:val="normal1"/>
-        <w:spacing w:lineRule="auto" w:line="240" w:before="240" w:after="240"/>
+        <w:spacing w:lineRule="auto" w:line="240" w:before="0" w:after="180"/>
         <w:rPr>
           <w:rFonts w:ascii="Arial" w:hAnsi="Arial" w:eastAsia="Arial" w:cs="Arial"/>
           <w:sz w:val="22"/>
           <w:szCs w:val="22"/>
-          <w:highlight w:val="yellow"/>
         </w:rPr>
       </w:pPr>
       <w:r>
-        <w:rPr>
-          <w:sz w:val="22"/>
-        </w:rPr>
+        <w:rPr/>
       </w:r>
     </w:p>
     <w:p>
@@ -620,7 +579,7 @@
         <w:rPr>
           <w:sz w:val="22"/>
         </w:rPr>
-        <w:t>My current work centers on deploying robot foundation models on physical hardware, and I am confident that experience translates directly to NEO’s development. I look forward to discussing how I can contribute.</w:t>
+        <w:t>I am eager to bring my expertise in deploying VLAs and RL policies to 1X, and I look forward to discussing how I can contribute to your work. Thank you for considering my application.</w:t>
       </w:r>
     </w:p>
     <w:p>
@@ -650,15 +609,15 @@
         <w:jc w:val="left"/>
         <w:rPr>
           <w:rFonts w:ascii="Arial" w:hAnsi="Arial" w:eastAsia="Arial" w:cs="Arial"/>
-          <w:sz w:val="22"/>
-          <w:szCs w:val="22"/>
+          <w:sz w:val="8"/>
+          <w:szCs w:val="8"/>
         </w:rPr>
       </w:pPr>
       <w:r>
         <w:rPr>
           <w:rFonts w:eastAsia="Arial" w:cs="Arial" w:ascii="Arial" w:hAnsi="Arial"/>
-          <w:sz w:val="22"/>
-          <w:szCs w:val="22"/>
+          <w:sz w:val="8"/>
+          <w:szCs w:val="8"/>
         </w:rPr>
       </w:r>
     </w:p>
@@ -1010,6 +969,7 @@
     <w:qFormat/>
     <w:pPr>
       <w:widowControl/>
+      <w:suppressAutoHyphens w:val="true"/>
       <w:bidi w:val="0"/>
       <w:spacing w:before="0" w:after="0"/>
       <w:jc w:val="left"/>
@@ -1033,7 +993,6 @@
       <w:keepLines w:val="false"/>
       <w:pageBreakBefore w:val="false"/>
       <w:widowControl/>
-      <w:pBdr/>
       <w:shd w:val="clear" w:fill="auto"/>
       <w:spacing w:lineRule="auto" w:line="240" w:before="0" w:after="0"/>
       <w:ind w:hanging="0" w:left="0" w:right="0"/>
@@ -1069,7 +1028,6 @@
       <w:keepLines w:val="false"/>
       <w:pageBreakBefore w:val="false"/>
       <w:widowControl/>
-      <w:pBdr/>
       <w:shd w:val="clear" w:fill="auto"/>
       <w:spacing w:lineRule="auto" w:line="240" w:before="0" w:after="0"/>
       <w:ind w:hanging="0" w:left="0" w:right="0"/>
@@ -1105,7 +1063,6 @@
       <w:keepLines w:val="false"/>
       <w:pageBreakBefore w:val="false"/>
       <w:widowControl/>
-      <w:pBdr/>
       <w:shd w:val="clear" w:fill="auto"/>
       <w:spacing w:lineRule="auto" w:line="240" w:before="0" w:after="0"/>
       <w:ind w:hanging="0" w:left="0" w:right="0"/>
@@ -1141,7 +1098,6 @@
       <w:keepLines w:val="false"/>
       <w:pageBreakBefore w:val="false"/>
       <w:widowControl/>
-      <w:pBdr/>
       <w:shd w:val="clear" w:fill="auto"/>
       <w:spacing w:lineRule="auto" w:line="240" w:before="0" w:after="0"/>
       <w:ind w:hanging="0" w:left="0" w:right="0"/>
@@ -1177,7 +1133,6 @@
       <w:keepLines w:val="false"/>
       <w:pageBreakBefore w:val="false"/>
       <w:widowControl/>
-      <w:pBdr/>
       <w:shd w:val="clear" w:fill="auto"/>
       <w:spacing w:lineRule="auto" w:line="240" w:before="0" w:after="0"/>
       <w:ind w:hanging="0" w:left="0" w:right="0"/>
@@ -1213,7 +1168,6 @@
       <w:keepLines w:val="false"/>
       <w:pageBreakBefore w:val="false"/>
       <w:widowControl/>
-      <w:pBdr/>
       <w:shd w:val="clear" w:fill="auto"/>
       <w:spacing w:lineRule="auto" w:line="240" w:before="0" w:after="0"/>
       <w:ind w:hanging="0" w:left="0" w:right="0"/>
@@ -1309,6 +1263,7 @@
     <w:qFormat/>
     <w:pPr>
       <w:widowControl/>
+      <w:suppressAutoHyphens w:val="true"/>
       <w:bidi w:val="0"/>
       <w:spacing w:before="0" w:after="0"/>
       <w:jc w:val="left"/>
@@ -1332,7 +1287,6 @@
       <w:keepLines w:val="false"/>
       <w:pageBreakBefore w:val="false"/>
       <w:widowControl/>
-      <w:pBdr/>
       <w:shd w:val="clear" w:fill="auto"/>
       <w:spacing w:lineRule="auto" w:line="240" w:before="0" w:after="0"/>
       <w:ind w:hanging="0" w:left="0" w:right="0"/>

</xml_diff>

<commit_message>
feat(applications): add resume, cover letter finals, and 1X/Google DeepMind application folders
Co-Authored-By: Claude Sonnet 4.6 <noreply@anthropic.com>
</commit_message>
<xml_diff>
--- a/cover_letter_1X_VLA.docx
+++ b/cover_letter_1X_VLA.docx
@@ -8,16 +8,19 @@
         <w:spacing w:lineRule="auto" w:line="240" w:before="0" w:after="160"/>
         <w:jc w:val="left"/>
         <w:rPr>
-          <w:rFonts w:ascii="Arial" w:hAnsi="Arial" w:eastAsia="Arial" w:cs="Arial"/>
+          <w:rFonts w:ascii="Arial\" w:hAnsi="Arial\" w:eastAsia="Arial" w:cs="Arial"/>
           <w:sz w:val="10"/>
           <w:szCs w:val="10"/>
+          <w:highlight w:val="none"/>
+          <w:shd w:fill="auto" w:val="clear"/>
         </w:rPr>
       </w:pPr>
       <w:r>
         <w:rPr>
-          <w:rFonts w:eastAsia="Arial" w:cs="Arial" w:ascii="Arial" w:hAnsi="Arial"/>
+          <w:rFonts w:eastAsia="Arial" w:cs="Arial" w:ascii="Arial\" w:hAnsi="Arial\"/>
           <w:sz w:val="10"/>
           <w:szCs w:val="10"/>
+          <w:shd w:fill="auto" w:val="clear"/>
         </w:rPr>
       </w:r>
     </w:p>
@@ -27,14 +30,17 @@
         <w:spacing w:lineRule="auto" w:line="240" w:before="0" w:after="160"/>
         <w:jc w:val="left"/>
         <w:rPr>
-          <w:rFonts w:ascii="Arial" w:hAnsi="Arial" w:eastAsia="Arial" w:cs="Arial"/>
+          <w:rFonts w:ascii="Arial\" w:hAnsi="Arial\"/>
+          <w:highlight w:val="none"/>
+          <w:shd w:fill="auto" w:val="clear"/>
         </w:rPr>
       </w:pPr>
       <w:r>
         <w:rPr>
-          <w:rFonts w:eastAsia="Arial" w:cs="Arial" w:ascii="Arial" w:hAnsi="Arial"/>
+          <w:rFonts w:eastAsia="Arial" w:cs="Arial" w:ascii="Arial\" w:hAnsi="Arial\"/>
           <w:sz w:val="22"/>
           <w:szCs w:val="22"/>
+          <w:shd w:fill="auto" w:val="clear"/>
         </w:rPr>
         <w:t>March 2026</w:t>
       </w:r>
@@ -45,14 +51,15 @@
         <w:spacing w:lineRule="auto" w:line="240" w:before="0" w:after="40"/>
         <w:jc w:val="left"/>
         <w:rPr>
-          <w:rFonts w:ascii="Arial" w:hAnsi="Arial" w:eastAsia="Arial" w:cs="Arial"/>
+          <w:rFonts w:ascii="Arial\" w:hAnsi="Arial\" w:eastAsia="Arial" w:cs="Arial"/>
+          <w:highlight w:val="none"/>
+          <w:shd w:fill="auto" w:val="clear"/>
         </w:rPr>
       </w:pPr>
       <w:r>
         <w:rPr>
-          <w:rFonts w:eastAsia="Arial" w:cs="Arial" w:ascii="Arial" w:hAnsi="Arial"/>
-          <w:sz w:val="8"/>
-          <w:szCs w:val="8"/>
+          <w:rFonts w:eastAsia="Arial" w:cs="Arial" w:ascii="Arial\" w:hAnsi="Arial\"/>
+          <w:shd w:fill="auto" w:val="clear"/>
         </w:rPr>
       </w:r>
     </w:p>
@@ -62,12 +69,16 @@
         <w:spacing w:lineRule="auto" w:line="240" w:before="0" w:after="180"/>
         <w:jc w:val="left"/>
         <w:rPr>
-          <w:rFonts w:ascii="Arial" w:hAnsi="Arial" w:eastAsia="Arial" w:cs="Arial"/>
+          <w:rFonts w:ascii="Arial\" w:hAnsi="Arial\"/>
+          <w:highlight w:val="none"/>
+          <w:shd w:fill="auto" w:val="clear"/>
         </w:rPr>
       </w:pPr>
       <w:r>
         <w:rPr>
+          <w:rFonts w:ascii="Arial\" w:hAnsi="Arial\"/>
           <w:sz w:val="22"/>
+          <w:shd w:fill="auto" w:val="clear"/>
         </w:rPr>
         <w:t>Dear 1X Hiring Team,</w:t>
       </w:r>
@@ -77,14 +88,16 @@
         <w:pStyle w:val="normal1"/>
         <w:spacing w:lineRule="auto" w:line="240" w:before="240" w:after="240"/>
         <w:rPr>
-          <w:rFonts w:ascii="Arial" w:hAnsi="Arial" w:eastAsia="Arial" w:cs="Arial"/>
+          <w:rFonts w:ascii="Arial\" w:hAnsi="Arial\"/>
+          <w:highlight w:val="none"/>
+          <w:shd w:fill="auto" w:val="clear"/>
+        </w:rPr>
+      </w:pPr>
+      <w:r>
+        <w:rPr>
+          <w:rFonts w:ascii="Arial\" w:hAnsi="Arial\"/>
           <w:sz w:val="22"/>
-          <w:szCs w:val="22"/>
-        </w:rPr>
-      </w:pPr>
-      <w:r>
-        <w:rPr>
-          <w:sz w:val="22"/>
+          <w:shd w:fill="auto" w:val="clear"/>
         </w:rPr>
         <w:t xml:space="preserve">I am a postdoctoral fellow in robotics at the University of Texas at Austin, and I am writing to apply for the AI Research Engineer, Vision-Language Action (VLA) Models position at 1X. </w:t>
       </w:r>
@@ -94,16 +107,28 @@
         <w:pStyle w:val="normal1"/>
         <w:spacing w:lineRule="auto" w:line="240" w:before="240" w:after="240"/>
         <w:rPr>
-          <w:rFonts w:ascii="Arial" w:hAnsi="Arial" w:eastAsia="Arial" w:cs="Arial"/>
+          <w:rFonts w:ascii="Arial\" w:hAnsi="Arial\"/>
+          <w:highlight w:val="none"/>
+          <w:shd w:fill="auto" w:val="clear"/>
+        </w:rPr>
+      </w:pPr>
+      <w:r>
+        <w:rPr>
+          <w:rFonts w:eastAsia="Arial" w:cs="Arial" w:ascii="Arial\" w:hAnsi="Arial\"/>
           <w:sz w:val="22"/>
           <w:szCs w:val="22"/>
-        </w:rPr>
-      </w:pPr>
-      <w:r>
-        <w:rPr>
+          <w:shd w:fill="auto" w:val="clear"/>
+        </w:rPr>
+        <w:t xml:space="preserve">My experience from my postdoc and as a co-founder of Multi AI spans the full stack from training VLA models on physical hardware to deploying learned policies at scale across unstructured production environments, a combination directly relevant to 1X's mission. </w:t>
+      </w:r>
+      <w:r>
+        <w:rPr>
+          <w:rFonts w:eastAsia="Arial" w:cs="Arial" w:ascii="Arial\" w:hAnsi="Arial\"/>
           <w:sz w:val="22"/>
-        </w:rPr>
-        <w:t>Deploying robot foundation models on physical hardware in unstructured environments is the focus of my postdoc, and the table below maps my experience to your requirements directly:</w:t>
+          <w:szCs w:val="22"/>
+          <w:shd w:fill="auto" w:val="clear"/>
+        </w:rPr>
+        <w:t>Below is a detailed comparison of the advertised requirements and my qualifications:</w:t>
       </w:r>
     </w:p>
     <w:tbl>
@@ -145,18 +170,19 @@
               <w:pStyle w:val="normal1"/>
               <w:spacing w:lineRule="auto" w:line="240" w:before="0" w:after="80"/>
               <w:rPr>
-                <w:rFonts w:ascii="Arial" w:hAnsi="Arial" w:eastAsia="Arial" w:cs="Arial"/>
-                <w:sz w:val="18"/>
-                <w:szCs w:val="18"/>
+                <w:rFonts w:ascii="Arial\" w:hAnsi="Arial\"/>
+                <w:highlight w:val="none"/>
+                <w:shd w:fill="auto" w:val="clear"/>
               </w:rPr>
             </w:pPr>
             <w:r>
               <w:rPr>
-                <w:rFonts w:eastAsia="Arial" w:cs="Arial" w:ascii="Arial" w:hAnsi="Arial"/>
+                <w:rFonts w:eastAsia="Arial" w:cs="Arial" w:ascii="Arial\" w:hAnsi="Arial\"/>
                 <w:b/>
                 <w:bCs/>
                 <w:sz w:val="18"/>
                 <w:szCs w:val="18"/>
+                <w:shd w:fill="auto" w:val="clear"/>
               </w:rPr>
               <w:t>Advertised Requirements</w:t>
             </w:r>
@@ -178,18 +204,19 @@
               <w:pStyle w:val="normal1"/>
               <w:spacing w:lineRule="auto" w:line="240" w:before="0" w:after="80"/>
               <w:rPr>
-                <w:rFonts w:ascii="Arial" w:hAnsi="Arial" w:eastAsia="Arial" w:cs="Arial"/>
-                <w:sz w:val="18"/>
-                <w:szCs w:val="18"/>
+                <w:rFonts w:ascii="Arial\" w:hAnsi="Arial\"/>
+                <w:highlight w:val="none"/>
+                <w:shd w:fill="auto" w:val="clear"/>
               </w:rPr>
             </w:pPr>
             <w:r>
               <w:rPr>
-                <w:rFonts w:eastAsia="Arial" w:cs="Arial" w:ascii="Arial" w:hAnsi="Arial"/>
+                <w:rFonts w:eastAsia="Arial" w:cs="Arial" w:ascii="Arial\" w:hAnsi="Arial\"/>
                 <w:b/>
                 <w:bCs/>
                 <w:sz w:val="18"/>
                 <w:szCs w:val="18"/>
+                <w:shd w:fill="auto" w:val="clear"/>
               </w:rPr>
               <w:t>My Qualifications</w:t>
             </w:r>
@@ -213,13 +240,19 @@
               <w:pStyle w:val="normal1"/>
               <w:spacing w:lineRule="auto" w:line="240" w:before="0" w:after="60"/>
               <w:rPr>
+                <w:rFonts w:ascii="Arial\" w:hAnsi="Arial\"/>
+                <w:sz w:val="16"/>
+                <w:szCs w:val="16"/>
                 <w:highlight w:val="none"/>
-                <w:shd w:fill="FFFF00" w:val="clear"/>
+                <w:shd w:fill="auto" w:val="clear"/>
               </w:rPr>
             </w:pPr>
             <w:r>
               <w:rPr>
-                <w:sz w:val="17"/>
+                <w:rFonts w:ascii="Arial\" w:hAnsi="Arial\"/>
+                <w:sz w:val="16"/>
+                <w:szCs w:val="16"/>
+                <w:shd w:fill="auto" w:val="clear"/>
               </w:rPr>
               <w:t>End-to-end ownership: data review, model design, deployment, fleet monitoring</w:t>
             </w:r>
@@ -240,15 +273,57 @@
               <w:pStyle w:val="normal1"/>
               <w:spacing w:lineRule="auto" w:line="240" w:before="0" w:after="60"/>
               <w:rPr>
+                <w:rFonts w:ascii="Arial\" w:hAnsi="Arial\"/>
+                <w:sz w:val="16"/>
+                <w:szCs w:val="16"/>
                 <w:highlight w:val="none"/>
-                <w:shd w:fill="FFFF00" w:val="clear"/>
+                <w:shd w:fill="auto" w:val="clear"/>
               </w:rPr>
             </w:pPr>
             <w:r>
               <w:rPr>
-                <w:sz w:val="17"/>
-              </w:rPr>
-              <w:t>At Multi AI, I owned the full lifecycle of a MARL platform, covering data pipelines, model design, production deployment, and fleet performance monitoring across 100+ vehicles.</w:t>
+                <w:rFonts w:ascii="Arial\" w:hAnsi="Arial\"/>
+                <w:sz w:val="16"/>
+                <w:szCs w:val="16"/>
+                <w:shd w:fill="auto" w:val="clear"/>
+              </w:rPr>
+              <w:t xml:space="preserve">At Multi AI, I owned the full lifecycle of a </w:t>
+            </w:r>
+            <w:r>
+              <w:rPr>
+                <w:rFonts w:ascii="Arial\" w:hAnsi="Arial\"/>
+                <w:sz w:val="16"/>
+                <w:szCs w:val="16"/>
+                <w:shd w:fill="auto" w:val="clear"/>
+              </w:rPr>
+              <w:t>multi-agent reinforcement learning</w:t>
+            </w:r>
+            <w:r>
+              <w:rPr>
+                <w:rFonts w:ascii="Arial\" w:hAnsi="Arial\"/>
+                <w:sz w:val="16"/>
+                <w:szCs w:val="16"/>
+                <w:shd w:fill="auto" w:val="clear"/>
+              </w:rPr>
+              <w:t xml:space="preserve"> platform, covering data pipelines, model design, production deployment, and fleet performance monitoring across 100+ vehicles </w:t>
+            </w:r>
+            <w:r>
+              <w:rPr>
+                <w:rFonts w:ascii="Arial\" w:hAnsi="Arial\"/>
+                <w:sz w:val="16"/>
+                <w:szCs w:val="16"/>
+                <w:shd w:fill="auto" w:val="clear"/>
+              </w:rPr>
+              <w:t xml:space="preserve">in wargaming </w:t>
+            </w:r>
+            <w:r>
+              <w:rPr>
+                <w:rFonts w:ascii="Arial\" w:hAnsi="Arial\"/>
+                <w:sz w:val="16"/>
+                <w:szCs w:val="16"/>
+                <w:shd w:fill="auto" w:val="clear"/>
+              </w:rPr>
+              <w:t>environments.</w:t>
             </w:r>
           </w:p>
         </w:tc>
@@ -270,13 +345,19 @@
               <w:pStyle w:val="normal1"/>
               <w:spacing w:lineRule="auto" w:line="240" w:before="0" w:after="60"/>
               <w:rPr>
+                <w:rFonts w:ascii="Arial\" w:hAnsi="Arial\"/>
+                <w:sz w:val="16"/>
+                <w:szCs w:val="16"/>
                 <w:highlight w:val="none"/>
-                <w:shd w:fill="FFFF00" w:val="clear"/>
+                <w:shd w:fill="auto" w:val="clear"/>
               </w:rPr>
             </w:pPr>
             <w:r>
               <w:rPr>
-                <w:sz w:val="17"/>
+                <w:rFonts w:ascii="Arial\" w:hAnsi="Arial\"/>
+                <w:sz w:val="16"/>
+                <w:szCs w:val="16"/>
+                <w:shd w:fill="auto" w:val="clear"/>
               </w:rPr>
               <w:t>Train for whole-body manipulation and navigation in unfamiliar environments</w:t>
             </w:r>
@@ -297,27 +378,21 @@
               <w:pStyle w:val="normal1"/>
               <w:spacing w:lineRule="auto" w:line="240" w:before="0" w:after="60"/>
               <w:rPr>
+                <w:rFonts w:ascii="Arial\" w:hAnsi="Arial\"/>
+                <w:sz w:val="16"/>
+                <w:szCs w:val="16"/>
                 <w:highlight w:val="none"/>
-                <w:shd w:fill="FFFF00" w:val="clear"/>
+                <w:shd w:fill="auto" w:val="clear"/>
               </w:rPr>
             </w:pPr>
             <w:r>
               <w:rPr>
-                <w:sz w:val="17"/>
-              </w:rPr>
-              <w:t xml:space="preserve">In my postdoc, I trained SmolVLA </w:t>
-            </w:r>
-            <w:r>
-              <w:rPr>
-                <w:sz w:val="17"/>
-              </w:rPr>
-              <w:t>and ACT</w:t>
-            </w:r>
-            <w:r>
-              <w:rPr>
-                <w:sz w:val="17"/>
-              </w:rPr>
-              <w:t xml:space="preserve"> on 200+ demonstration episodes for household manipulation tasks on a custom bimanual platform and trained Spot for bipedal locomotion with PPO and domain randomization in NVIDIA Isaac Lab, deploying both on physical hardware.</w:t>
+                <w:rFonts w:ascii="Arial\" w:hAnsi="Arial\"/>
+                <w:sz w:val="16"/>
+                <w:szCs w:val="16"/>
+                <w:shd w:fill="auto" w:val="clear"/>
+              </w:rPr>
+              <w:t>In my postdoc, I trained SmolVLA and ACT on 200+ demonstration episodes for household manipulation tasks on a custom bimanual platform and trained Spot for bipedal locomotion with PPO and domain randomization in NVIDIA Isaac Lab, deploying both on physical hardware.</w:t>
             </w:r>
           </w:p>
         </w:tc>
@@ -339,13 +414,19 @@
               <w:pStyle w:val="normal1"/>
               <w:spacing w:lineRule="auto" w:line="240" w:before="0" w:after="60"/>
               <w:rPr>
+                <w:rFonts w:ascii="Arial\" w:hAnsi="Arial\"/>
+                <w:sz w:val="16"/>
+                <w:szCs w:val="16"/>
                 <w:highlight w:val="none"/>
-                <w:shd w:fill="FFFF00" w:val="clear"/>
+                <w:shd w:fill="auto" w:val="clear"/>
               </w:rPr>
             </w:pPr>
             <w:r>
               <w:rPr>
-                <w:sz w:val="17"/>
+                <w:rFonts w:ascii="Arial\" w:hAnsi="Arial\"/>
+                <w:sz w:val="16"/>
+                <w:szCs w:val="16"/>
+                <w:shd w:fill="auto" w:val="clear"/>
               </w:rPr>
               <w:t>Design and validate robust evaluation metrics for scalable model pre-training</w:t>
             </w:r>
@@ -366,15 +447,48 @@
               <w:pStyle w:val="normal1"/>
               <w:spacing w:lineRule="auto" w:line="240" w:before="0" w:after="60"/>
               <w:rPr>
+                <w:rFonts w:ascii="Arial\" w:hAnsi="Arial\"/>
+                <w:sz w:val="16"/>
+                <w:szCs w:val="16"/>
                 <w:highlight w:val="none"/>
-                <w:shd w:fill="FFFF00" w:val="clear"/>
+                <w:shd w:fill="auto" w:val="clear"/>
               </w:rPr>
             </w:pPr>
             <w:r>
               <w:rPr>
-                <w:sz w:val="17"/>
-              </w:rPr>
-              <w:t>For my PhD, I designed custom accuracy metrics comparing aerial versus ground-based 3D printing systems validated on hardware; for Multi AI, I designed platform benchmarks measured against 24-hour manual planning baselines in live US Air Force exercises.</w:t>
+                <w:rFonts w:ascii="Arial\" w:hAnsi="Arial\"/>
+                <w:sz w:val="16"/>
+                <w:szCs w:val="16"/>
+                <w:shd w:fill="auto" w:val="clear"/>
+              </w:rPr>
+              <w:t>F</w:t>
+            </w:r>
+            <w:r>
+              <w:rPr>
+                <w:rFonts w:ascii="Arial\" w:hAnsi="Arial\"/>
+                <w:sz w:val="16"/>
+                <w:szCs w:val="16"/>
+                <w:shd w:fill="auto" w:val="clear"/>
+              </w:rPr>
+              <w:t xml:space="preserve">or Multi AI, I designed platform benchmarks measured against 24-hour manual planning baselines in </w:t>
+            </w:r>
+            <w:r>
+              <w:rPr>
+                <w:rFonts w:ascii="Arial\" w:hAnsi="Arial\"/>
+                <w:sz w:val="16"/>
+                <w:szCs w:val="16"/>
+                <w:shd w:fill="auto" w:val="clear"/>
+              </w:rPr>
+              <w:t xml:space="preserve">multi-agent RL wargaming </w:t>
+            </w:r>
+            <w:r>
+              <w:rPr>
+                <w:rFonts w:ascii="Arial\" w:hAnsi="Arial\"/>
+                <w:sz w:val="16"/>
+                <w:szCs w:val="16"/>
+                <w:shd w:fill="auto" w:val="clear"/>
+              </w:rPr>
+              <w:t>exercises.</w:t>
             </w:r>
           </w:p>
         </w:tc>
@@ -396,13 +510,19 @@
               <w:pStyle w:val="normal1"/>
               <w:spacing w:lineRule="auto" w:line="240" w:before="0" w:after="60"/>
               <w:rPr>
+                <w:rFonts w:ascii="Arial\" w:hAnsi="Arial\"/>
+                <w:sz w:val="16"/>
+                <w:szCs w:val="16"/>
                 <w:highlight w:val="none"/>
-                <w:shd w:fill="FFFF00" w:val="clear"/>
+                <w:shd w:fill="auto" w:val="clear"/>
               </w:rPr>
             </w:pPr>
             <w:r>
               <w:rPr>
-                <w:sz w:val="17"/>
+                <w:rFonts w:ascii="Arial\" w:hAnsi="Arial\"/>
+                <w:sz w:val="16"/>
+                <w:szCs w:val="16"/>
+                <w:shd w:fill="auto" w:val="clear"/>
               </w:rPr>
               <w:t>VLA and generative model techniques for action prediction</w:t>
             </w:r>
@@ -423,15 +543,21 @@
               <w:pStyle w:val="normal1"/>
               <w:spacing w:lineRule="auto" w:line="240" w:before="0" w:after="60"/>
               <w:rPr>
+                <w:rFonts w:ascii="Arial\" w:hAnsi="Arial\"/>
+                <w:sz w:val="16"/>
+                <w:szCs w:val="16"/>
                 <w:highlight w:val="none"/>
-                <w:shd w:fill="FFFF00" w:val="clear"/>
+                <w:shd w:fill="auto" w:val="clear"/>
               </w:rPr>
             </w:pPr>
             <w:r>
               <w:rPr>
-                <w:sz w:val="17"/>
-              </w:rPr>
-              <w:t>In my postdoc, I deployed and evaluated DreamZero, π₀.₅, SmolVLA, and ACT across 36 episodes in 12 tasks in simulation and on physical hardware, using PyTorch throughout.</w:t>
+                <w:rFonts w:ascii="Arial\" w:hAnsi="Arial\"/>
+                <w:sz w:val="16"/>
+                <w:szCs w:val="16"/>
+                <w:shd w:fill="auto" w:val="clear"/>
+              </w:rPr>
+              <w:t>In my postdoc, I deployed and evaluated DreamZero, π₀.₅, SmolVLA, and ACT across simulation and physical hardware to assess current semantic and novel verb limitations of existing models.</w:t>
             </w:r>
           </w:p>
         </w:tc>
@@ -453,13 +579,19 @@
               <w:pStyle w:val="normal1"/>
               <w:spacing w:lineRule="auto" w:line="240" w:before="0" w:after="60"/>
               <w:rPr>
+                <w:rFonts w:ascii="Arial\" w:hAnsi="Arial\"/>
+                <w:sz w:val="16"/>
+                <w:szCs w:val="16"/>
                 <w:highlight w:val="none"/>
-                <w:shd w:fill="FFFF00" w:val="clear"/>
+                <w:shd w:fill="auto" w:val="clear"/>
               </w:rPr>
             </w:pPr>
             <w:r>
               <w:rPr>
-                <w:sz w:val="17"/>
+                <w:rFonts w:ascii="Arial\" w:hAnsi="Arial\"/>
+                <w:sz w:val="16"/>
+                <w:szCs w:val="16"/>
+                <w:shd w:fill="auto" w:val="clear"/>
               </w:rPr>
               <w:t>Cross-functional collaboration to deploy RL policies and operationalize models</w:t>
             </w:r>
@@ -480,15 +612,21 @@
               <w:pStyle w:val="normal1"/>
               <w:spacing w:lineRule="auto" w:line="240" w:before="0" w:after="60"/>
               <w:rPr>
+                <w:rFonts w:ascii="Arial\" w:hAnsi="Arial\"/>
+                <w:sz w:val="16"/>
+                <w:szCs w:val="16"/>
                 <w:highlight w:val="none"/>
-                <w:shd w:fill="FFFF00" w:val="clear"/>
+                <w:shd w:fill="auto" w:val="clear"/>
               </w:rPr>
             </w:pPr>
             <w:r>
               <w:rPr>
-                <w:sz w:val="17"/>
-              </w:rPr>
-              <w:t>At Multi AI, I embedded with controls, QA, and data teams through full deployment cycles to operationalize MARL policies; during my PhD, I collaborated across five institutions on a multi-year NSF Cyberphysical Systems project.</w:t>
+                <w:rFonts w:ascii="Arial\" w:hAnsi="Arial\"/>
+                <w:sz w:val="16"/>
+                <w:szCs w:val="16"/>
+                <w:shd w:fill="auto" w:val="clear"/>
+              </w:rPr>
+              <w:t>At Multi AI, I embedded with controls, QA, and data teams through full deployment cycles to operationalize MARL policies; during my PhD, I collaborated as lead researcher across five institutions on a multi-year NSF Cyberphysical Systems project.</w:t>
             </w:r>
           </w:p>
         </w:tc>
@@ -510,13 +648,19 @@
               <w:pStyle w:val="normal1"/>
               <w:spacing w:lineRule="auto" w:line="240" w:before="0" w:after="60"/>
               <w:rPr>
+                <w:rFonts w:ascii="Arial\" w:hAnsi="Arial\"/>
+                <w:sz w:val="16"/>
+                <w:szCs w:val="16"/>
                 <w:highlight w:val="none"/>
-                <w:shd w:fill="FFFF00" w:val="clear"/>
+                <w:shd w:fill="auto" w:val="clear"/>
               </w:rPr>
             </w:pPr>
             <w:r>
               <w:rPr>
-                <w:sz w:val="17"/>
+                <w:rFonts w:ascii="Arial\" w:hAnsi="Arial\"/>
+                <w:sz w:val="16"/>
+                <w:szCs w:val="16"/>
+                <w:shd w:fill="auto" w:val="clear"/>
               </w:rPr>
               <w:t>Python, PyTorch, and simulation environments (Isaac Sim / MuJoCo)</w:t>
             </w:r>
@@ -537,15 +681,21 @@
               <w:pStyle w:val="normal1"/>
               <w:spacing w:lineRule="auto" w:line="240" w:before="0" w:after="60"/>
               <w:rPr>
+                <w:rFonts w:ascii="Arial\" w:hAnsi="Arial\"/>
+                <w:sz w:val="16"/>
+                <w:szCs w:val="16"/>
                 <w:highlight w:val="none"/>
-                <w:shd w:fill="FFFF00" w:val="clear"/>
+                <w:shd w:fill="auto" w:val="clear"/>
               </w:rPr>
             </w:pPr>
             <w:r>
               <w:rPr>
-                <w:sz w:val="17"/>
-              </w:rPr>
-              <w:t>Python is my primary language and PyTorch my primary framework across all research and production work; I trained and transferred policies in NVIDIA Isaac Lab (Spot bipedal locomotion) and evaluated VLA models in DROID simulation. Build system experience is primarily CMake, with Bazel familiarity.</w:t>
+                <w:rFonts w:ascii="Arial\" w:hAnsi="Arial\"/>
+                <w:sz w:val="16"/>
+                <w:szCs w:val="16"/>
+                <w:shd w:fill="auto" w:val="clear"/>
+              </w:rPr>
+              <w:t>Python is my primary language and PyTorch my primary framework across all research and production work; I trained and transferred policies in NVIDIA Isaac Lab (Spot bipedal locomotion) and evaluated VLA models in DROID simulation. I have build experience with Cmake and Bazel.</w:t>
             </w:r>
           </w:p>
         </w:tc>
@@ -556,13 +706,20 @@
         <w:pStyle w:val="normal1"/>
         <w:spacing w:lineRule="auto" w:line="240" w:before="0" w:after="180"/>
         <w:rPr>
-          <w:rFonts w:ascii="Arial" w:hAnsi="Arial" w:eastAsia="Arial" w:cs="Arial"/>
+          <w:rFonts w:ascii="Arial\" w:hAnsi="Arial\" w:eastAsia="Arial" w:cs="Arial"/>
           <w:sz w:val="22"/>
           <w:szCs w:val="22"/>
+          <w:highlight w:val="none"/>
+          <w:shd w:fill="auto" w:val="clear"/>
         </w:rPr>
       </w:pPr>
       <w:r>
-        <w:rPr/>
+        <w:rPr>
+          <w:rFonts w:eastAsia="Arial" w:cs="Arial" w:ascii="Arial\" w:hAnsi="Arial\"/>
+          <w:sz w:val="22"/>
+          <w:szCs w:val="22"/>
+          <w:shd w:fill="auto" w:val="clear"/>
+        </w:rPr>
       </w:r>
     </w:p>
     <w:p>
@@ -570,14 +727,16 @@
         <w:pStyle w:val="normal1"/>
         <w:spacing w:lineRule="auto" w:line="240" w:before="0" w:after="180"/>
         <w:rPr>
-          <w:rFonts w:ascii="Arial" w:hAnsi="Arial" w:eastAsia="Arial" w:cs="Arial"/>
+          <w:rFonts w:ascii="Arial\" w:hAnsi="Arial\"/>
+          <w:highlight w:val="none"/>
+          <w:shd w:fill="auto" w:val="clear"/>
+        </w:rPr>
+      </w:pPr>
+      <w:r>
+        <w:rPr>
+          <w:rFonts w:ascii="Arial\" w:hAnsi="Arial\"/>
           <w:sz w:val="22"/>
-          <w:szCs w:val="22"/>
-        </w:rPr>
-      </w:pPr>
-      <w:r>
-        <w:rPr>
-          <w:sz w:val="22"/>
+          <w:shd w:fill="auto" w:val="clear"/>
         </w:rPr>
         <w:t>I am eager to bring my expertise in deploying VLAs and RL policies to 1X, and I look forward to discussing how I can contribute to your work. Thank you for considering my application.</w:t>
       </w:r>
@@ -588,16 +747,17 @@
         <w:spacing w:lineRule="auto" w:line="240" w:before="0" w:after="300"/>
         <w:jc w:val="left"/>
         <w:rPr>
-          <w:rFonts w:ascii="Arial" w:hAnsi="Arial" w:eastAsia="Arial" w:cs="Arial"/>
+          <w:rFonts w:ascii="Arial\" w:hAnsi="Arial\"/>
+          <w:highlight w:val="none"/>
+          <w:shd w:fill="auto" w:val="clear"/>
+        </w:rPr>
+      </w:pPr>
+      <w:r>
+        <w:rPr>
+          <w:rFonts w:eastAsia="Arial" w:cs="Arial" w:ascii="Arial\" w:hAnsi="Arial\"/>
           <w:sz w:val="22"/>
           <w:szCs w:val="22"/>
-        </w:rPr>
-      </w:pPr>
-      <w:r>
-        <w:rPr>
-          <w:rFonts w:eastAsia="Arial" w:cs="Arial" w:ascii="Arial" w:hAnsi="Arial"/>
-          <w:sz w:val="22"/>
-          <w:szCs w:val="22"/>
+          <w:shd w:fill="auto" w:val="clear"/>
         </w:rPr>
         <w:t>Sincerely,</w:t>
       </w:r>
@@ -608,16 +768,19 @@
         <w:spacing w:lineRule="auto" w:line="240" w:before="0" w:after="300"/>
         <w:jc w:val="left"/>
         <w:rPr>
-          <w:rFonts w:ascii="Arial" w:hAnsi="Arial" w:eastAsia="Arial" w:cs="Arial"/>
+          <w:rFonts w:ascii="Arial\" w:hAnsi="Arial\" w:eastAsia="Arial" w:cs="Arial"/>
           <w:sz w:val="8"/>
           <w:szCs w:val="8"/>
+          <w:highlight w:val="none"/>
+          <w:shd w:fill="auto" w:val="clear"/>
         </w:rPr>
       </w:pPr>
       <w:r>
         <w:rPr>
-          <w:rFonts w:eastAsia="Arial" w:cs="Arial" w:ascii="Arial" w:hAnsi="Arial"/>
+          <w:rFonts w:eastAsia="Arial" w:cs="Arial" w:ascii="Arial\" w:hAnsi="Arial\"/>
           <w:sz w:val="8"/>
           <w:szCs w:val="8"/>
+          <w:shd w:fill="auto" w:val="clear"/>
         </w:rPr>
       </w:r>
     </w:p>
@@ -627,16 +790,19 @@
         <w:spacing w:lineRule="auto" w:line="240" w:before="0" w:after="40"/>
         <w:jc w:val="left"/>
         <w:rPr>
-          <w:rFonts w:ascii="Arial" w:hAnsi="Arial" w:eastAsia="Arial" w:cs="Arial"/>
+          <w:rFonts w:ascii="Arial\" w:hAnsi="Arial\"/>
+          <w:highlight w:val="none"/>
+          <w:shd w:fill="auto" w:val="clear"/>
         </w:rPr>
       </w:pPr>
       <w:r>
         <w:rPr>
-          <w:rFonts w:eastAsia="Arial" w:cs="Arial" w:ascii="Arial" w:hAnsi="Arial"/>
+          <w:rFonts w:eastAsia="Arial" w:cs="Arial" w:ascii="Arial\" w:hAnsi="Arial\"/>
           <w:b/>
           <w:bCs/>
           <w:sz w:val="22"/>
           <w:szCs w:val="22"/>
+          <w:shd w:fill="auto" w:val="clear"/>
         </w:rPr>
         <w:t>Alexander Nettekoven, Ph.D.</w:t>
       </w:r>
@@ -647,14 +813,17 @@
         <w:spacing w:lineRule="auto" w:line="240" w:before="0" w:after="40"/>
         <w:jc w:val="left"/>
         <w:rPr>
-          <w:rFonts w:ascii="Arial" w:hAnsi="Arial" w:eastAsia="Arial" w:cs="Arial"/>
+          <w:rFonts w:ascii="Arial\" w:hAnsi="Arial\"/>
+          <w:highlight w:val="none"/>
+          <w:shd w:fill="auto" w:val="clear"/>
         </w:rPr>
       </w:pPr>
       <w:r>
         <w:rPr>
-          <w:rFonts w:eastAsia="Arial" w:cs="Arial" w:ascii="Arial" w:hAnsi="Arial"/>
+          <w:rFonts w:eastAsia="Arial" w:cs="Arial" w:ascii="Arial\" w:hAnsi="Arial\"/>
           <w:sz w:val="22"/>
           <w:szCs w:val="22"/>
+          <w:shd w:fill="auto" w:val="clear"/>
         </w:rPr>
         <w:t>Postdoctoral Fellow, Center for Autonomy, UT Austin</w:t>
       </w:r>
@@ -664,28 +833,28 @@
         <w:pStyle w:val="normal1"/>
         <w:spacing w:lineRule="auto" w:line="240" w:before="0" w:after="0"/>
         <w:jc w:val="left"/>
-        <w:rPr>
-          <w:rFonts w:ascii="Arial" w:hAnsi="Arial" w:eastAsia="Arial" w:cs="Arial"/>
-        </w:rPr>
+        <w:rPr/>
       </w:pPr>
       <w:hyperlink r:id="rId2">
         <w:r>
           <w:rPr>
             <w:rStyle w:val="ListLabel1"/>
-            <w:rFonts w:eastAsia="Arial" w:cs="Arial" w:ascii="Arial" w:hAnsi="Arial"/>
+            <w:rFonts w:eastAsia="Arial" w:cs="Arial" w:ascii="Arial\" w:hAnsi="Arial\"/>
             <w:color w:val="1155CC"/>
             <w:sz w:val="22"/>
             <w:szCs w:val="22"/>
             <w:u w:val="single"/>
+            <w:shd w:fill="auto" w:val="clear"/>
           </w:rPr>
           <w:t>nettekoven@utexas.edu</w:t>
         </w:r>
       </w:hyperlink>
       <w:r>
         <w:rPr>
-          <w:rFonts w:eastAsia="Arial" w:cs="Arial" w:ascii="Arial" w:hAnsi="Arial"/>
+          <w:rFonts w:eastAsia="Arial" w:cs="Arial" w:ascii="Arial\" w:hAnsi="Arial\"/>
           <w:sz w:val="22"/>
           <w:szCs w:val="22"/>
+          <w:shd w:fill="auto" w:val="clear"/>
         </w:rPr>
         <w:t xml:space="preserve">  | </w:t>
       </w:r>
@@ -693,20 +862,22 @@
         <w:r>
           <w:rPr>
             <w:rStyle w:val="ListLabel1"/>
-            <w:rFonts w:eastAsia="Arial" w:cs="Arial" w:ascii="Arial" w:hAnsi="Arial"/>
+            <w:rFonts w:eastAsia="Arial" w:cs="Arial" w:ascii="Arial\" w:hAnsi="Arial\"/>
             <w:color w:val="1155CC"/>
             <w:sz w:val="22"/>
             <w:szCs w:val="22"/>
             <w:u w:val="single"/>
+            <w:shd w:fill="auto" w:val="clear"/>
           </w:rPr>
           <w:t>alexander-nettekoven.com</w:t>
         </w:r>
       </w:hyperlink>
       <w:r>
         <w:rPr>
-          <w:rFonts w:eastAsia="Arial" w:cs="Arial" w:ascii="Arial" w:hAnsi="Arial"/>
+          <w:rFonts w:eastAsia="Arial" w:cs="Arial" w:ascii="Arial\" w:hAnsi="Arial\"/>
           <w:sz w:val="22"/>
           <w:szCs w:val="22"/>
+          <w:shd w:fill="auto" w:val="clear"/>
         </w:rPr>
         <w:t xml:space="preserve"> </w:t>
       </w:r>
@@ -1367,6 +1538,16 @@
       <w:b/>
       <w:bCs/>
     </w:rPr>
+  </w:style>
+  <w:style w:type="paragraph" w:styleId="BlockQuotation">
+    <w:name w:val="Block Quotation"/>
+    <w:basedOn w:val="Normal"/>
+    <w:qFormat/>
+    <w:pPr>
+      <w:spacing w:before="0" w:after="283"/>
+      <w:ind w:hanging="0" w:left="567" w:right="567"/>
+    </w:pPr>
+    <w:rPr/>
   </w:style>
   <w:style w:type="table" w:default="1" w:styleId="TableNormal">
     <w:name w:val="TableNormal"/>

</xml_diff>